<commit_message>
Record the group name, lecturer, and submission date.
The cover now names Point Break, Dr Masethe, and 20 October 2026, and the submission package uses the same details.

Co-authored-by: Thabang Mokoena <MokoenaThabang@users.noreply.github.com>
</commit_message>
<xml_diff>
--- a/submission_package/Documentation/Concept_Notes.docx
+++ b/submission_package/Documentation/Concept_Notes.docx
@@ -18,25 +18,7 @@
           <w:i w:val="0"/>
           <w:sz w:val="22"/>
         </w:rPr>
-        <w:t xml:space="preserve">One page for the pre-modelling checkpoint. Roster, group number and lecturer: </w:t>
-      </w:r>
-      <w:r>
-        <w:rPr>
-          <w:rFonts w:ascii="Calibri" w:hAnsi="Calibri" w:eastAsia="Calibri"/>
-          <w:b/>
-          <w:i w:val="0"/>
-          <w:sz w:val="22"/>
-        </w:rPr>
-        <w:t>TBD later</w:t>
-      </w:r>
-      <w:r>
-        <w:rPr>
-          <w:rFonts w:ascii="Calibri" w:hAnsi="Calibri" w:eastAsia="Calibri"/>
-          <w:b w:val="0"/>
-          <w:i w:val="0"/>
-          <w:sz w:val="22"/>
-        </w:rPr>
-        <w:t xml:space="preserve"> (do not invent).</w:t>
+        <w:t>One page for the pre-modelling checkpoint. Group name: Point Break. Lecturer: Dr Masethe. Submission date: 20 October 2026.</w:t>
       </w:r>
     </w:p>
     <w:tbl>

</xml_diff>